<commit_message>
Add Zenodo DOI to AgentGuard paper
</commit_message>
<xml_diff>
--- a/paper/agentguard-paper.docx
+++ b/paper/agentguard-paper.docx
@@ -7,7 +7,13 @@
         <w:pStyle w:val="Title"/>
       </w:pPr>
       <w:r>
-        <w:t xml:space="preserve">AgentGuard: Deterministic Security Linting for AI Agent Definitions</w:t>
+        <w:t xml:space="preserve">AgentGuard: Deterministic Security Linting</w:t>
+      </w:r>
+      <w:r>
+        <w:br/>
+      </w:r>
+      <w:r>
+        <w:t xml:space="preserve">for AI Agent Definitions</w:t>
       </w:r>
     </w:p>
     <w:p>
@@ -17,6 +23,19 @@
       <w:r>
         <w:t xml:space="preserve">Ying Chen</w:t>
       </w:r>
+    </w:p>
+    <w:p>
+      <w:pPr>
+        <w:pStyle w:val="Date"/>
+      </w:pPr>
+      <w:hyperlink r:id="rId9">
+        <w:r>
+          <w:rPr>
+            <w:rStyle w:val="Hyperlink"/>
+          </w:rPr>
+          <w:t xml:space="preserve">doi:10.5281/zenodo.21420490</w:t>
+        </w:r>
+      </w:hyperlink>
     </w:p>
     <w:p>
       <w:pPr>
@@ -167,7 +186,7 @@
         <w:t xml:space="preserve">benchmark-gated CI check rather than a manual review afterthought.</w:t>
       </w:r>
     </w:p>
-    <w:bookmarkStart w:id="10" w:name="introduction"/>
+    <w:bookmarkStart w:id="11" w:name="introduction"/>
     <w:p>
       <w:pPr>
         <w:pStyle w:val="Heading1"/>
@@ -386,7 +405,7 @@
         <w:t xml:space="preserve">enforced by a gated benchmark rather than asserted.</w:t>
       </w:r>
     </w:p>
-    <w:bookmarkStart w:id="9" w:name="contributions."/>
+    <w:bookmarkStart w:id="10" w:name="contributions."/>
     <w:p>
       <w:pPr>
         <w:pStyle w:val="Heading4"/>
@@ -539,9 +558,9 @@
         <w:t xml:space="preserve">injection-to-action attacks.</w:t>
       </w:r>
     </w:p>
-    <w:bookmarkEnd w:id="9"/>
     <w:bookmarkEnd w:id="10"/>
-    <w:bookmarkStart w:id="20" w:name="method"/>
+    <w:bookmarkEnd w:id="11"/>
+    <w:bookmarkStart w:id="21" w:name="method"/>
     <w:p>
       <w:pPr>
         <w:pStyle w:val="Heading1"/>
@@ -590,7 +609,7 @@
         <w:t xml:space="preserve">GitHub Action, baseline gate, and posture score.</w:t>
       </w:r>
     </w:p>
-    <w:bookmarkStart w:id="11" w:name="fig:system"/>
+    <w:bookmarkStart w:id="12" w:name="fig:system"/>
     <w:tbl>
       <w:tblPr>
         <w:tblStyle w:val="FigureTable"/>
@@ -641,8 +660,8 @@
         <w:t xml:space="preserve">metamorphic adversarial variants in the quality gate.</w:t>
       </w:r>
     </w:p>
-    <w:bookmarkEnd w:id="11"/>
-    <w:bookmarkStart w:id="12" w:name="problem-formalization"/>
+    <w:bookmarkEnd w:id="12"/>
+    <w:bookmarkStart w:id="13" w:name="problem-formalization"/>
     <w:p>
       <w:pPr>
         <w:pStyle w:val="Heading2"/>
@@ -1713,8 +1732,8 @@
         <w:t xml:space="preserve">ATLAS mapping, and a one-line fix.</w:t>
       </w:r>
     </w:p>
-    <w:bookmarkEnd w:id="12"/>
-    <w:bookmarkStart w:id="14" w:name="worked-example"/>
+    <w:bookmarkEnd w:id="13"/>
+    <w:bookmarkStart w:id="15" w:name="worked-example"/>
     <w:p>
       <w:pPr>
         <w:pStyle w:val="Heading2"/>
@@ -2009,7 +2028,7 @@
         <w:t xml:space="preserve">fix—a treat-as-data guard plus a scoped grant—clears both findings.</w:t>
       </w:r>
     </w:p>
-    <w:bookmarkStart w:id="13" w:name="fig:worked"/>
+    <w:bookmarkStart w:id="14" w:name="fig:worked"/>
     <w:tbl>
       <w:tblPr>
         <w:tblStyle w:val="FigureTable"/>
@@ -2220,9 +2239,9 @@
         <w:t xml:space="preserve">triage agent—which is precisely why the preconditions are so prevalent in the field study.</w:t>
       </w:r>
     </w:p>
-    <w:bookmarkEnd w:id="13"/>
     <w:bookmarkEnd w:id="14"/>
-    <w:bookmarkStart w:id="16" w:name="rule-taxonomy"/>
+    <w:bookmarkEnd w:id="15"/>
+    <w:bookmarkStart w:id="17" w:name="rule-taxonomy"/>
     <w:p>
       <w:pPr>
         <w:pStyle w:val="Heading2"/>
@@ -2418,7 +2437,7 @@
         <w:t xml:space="preserve">what that tier promises.</w:t>
       </w:r>
     </w:p>
-    <w:bookmarkStart w:id="15" w:name="tab:taxonomy"/>
+    <w:bookmarkStart w:id="16" w:name="tab:taxonomy"/>
     <w:p>
       <w:pPr>
         <w:pStyle w:val="TableCaption"/>
@@ -2777,9 +2796,9 @@
         </w:tc>
       </w:tr>
     </w:tbl>
-    <w:bookmarkEnd w:id="15"/>
     <w:bookmarkEnd w:id="16"/>
-    <w:bookmarkStart w:id="17" w:name="security-posture-score"/>
+    <w:bookmarkEnd w:id="17"/>
+    <w:bookmarkStart w:id="18" w:name="security-posture-score"/>
     <w:p>
       <w:pPr>
         <w:pStyle w:val="Heading2"/>
@@ -3149,8 +3168,8 @@
         <w:t xml:space="preserve">rather than opaque.</w:t>
       </w:r>
     </w:p>
-    <w:bookmarkEnd w:id="17"/>
-    <w:bookmarkStart w:id="18" w:name="X158d0f8a611e7c43cbc8feb154505317623e037"/>
+    <w:bookmarkEnd w:id="18"/>
+    <w:bookmarkStart w:id="19" w:name="X158d0f8a611e7c43cbc8feb154505317623e037"/>
     <w:p>
       <w:pPr>
         <w:pStyle w:val="Heading2"/>
@@ -3288,8 +3307,8 @@
         <w:t xml:space="preserve">into an aggregate number.</w:t>
       </w:r>
     </w:p>
-    <w:bookmarkEnd w:id="18"/>
-    <w:bookmarkStart w:id="19" w:name="ci-integration-and-baseline-gating"/>
+    <w:bookmarkEnd w:id="19"/>
+    <w:bookmarkStart w:id="20" w:name="ci-integration-and-baseline-gating"/>
     <w:p>
       <w:pPr>
         <w:pStyle w:val="Heading2"/>
@@ -3379,9 +3398,9 @@
         <w:t xml:space="preserve">workflow.</w:t>
       </w:r>
     </w:p>
-    <w:bookmarkEnd w:id="19"/>
     <w:bookmarkEnd w:id="20"/>
-    <w:bookmarkStart w:id="26" w:name="experiments"/>
+    <w:bookmarkEnd w:id="21"/>
+    <w:bookmarkStart w:id="27" w:name="experiments"/>
     <w:p>
       <w:pPr>
         <w:pStyle w:val="Heading1"/>
@@ -3517,7 +3536,7 @@
         <w:t xml:space="preserve">continuously re-verified rather than frozen at submission time.</w:t>
       </w:r>
     </w:p>
-    <w:bookmarkStart w:id="24" w:name="cost."/>
+    <w:bookmarkStart w:id="25" w:name="cost."/>
     <w:p>
       <w:pPr>
         <w:pStyle w:val="Heading4"/>
@@ -3558,7 +3577,7 @@
         <w:t xml:space="preserve">are therefore free in practice, which is the economic premise of the CI-gate design.</w:t>
       </w:r>
     </w:p>
-    <w:bookmarkStart w:id="21" w:name="tab:benchmark"/>
+    <w:bookmarkStart w:id="22" w:name="tab:benchmark"/>
     <w:p>
       <w:pPr>
         <w:pStyle w:val="TableCaption"/>
@@ -4000,8 +4019,8 @@
         </w:tc>
       </w:tr>
     </w:tbl>
-    <w:bookmarkEnd w:id="21"/>
-    <w:bookmarkStart w:id="22" w:name="tab:field"/>
+    <w:bookmarkEnd w:id="22"/>
+    <w:bookmarkStart w:id="23" w:name="tab:field"/>
     <w:p>
       <w:pPr>
         <w:pStyle w:val="TableCaption"/>
@@ -4299,8 +4318,8 @@
         </w:tc>
       </w:tr>
     </w:tbl>
-    <w:bookmarkEnd w:id="22"/>
-    <w:bookmarkStart w:id="23" w:name="tab:field-kind"/>
+    <w:bookmarkEnd w:id="23"/>
+    <w:bookmarkStart w:id="24" w:name="tab:field-kind"/>
     <w:p>
       <w:pPr>
         <w:pStyle w:val="TableCaption"/>
@@ -4613,9 +4632,9 @@
         </w:tc>
       </w:tr>
     </w:tbl>
-    <w:bookmarkEnd w:id="23"/>
     <w:bookmarkEnd w:id="24"/>
-    <w:bookmarkStart w:id="25" w:name="precision-hardening-case-studies."/>
+    <w:bookmarkEnd w:id="25"/>
+    <w:bookmarkStart w:id="26" w:name="precision-hardening-case-studies."/>
     <w:p>
       <w:pPr>
         <w:pStyle w:val="Heading4"/>
@@ -4702,9 +4721,9 @@
         <w:t xml:space="preserve">on real definitions and treating every false positive as a gate-level bug.</w:t>
       </w:r>
     </w:p>
-    <w:bookmarkEnd w:id="25"/>
     <w:bookmarkEnd w:id="26"/>
-    <w:bookmarkStart w:id="33" w:name="results"/>
+    <w:bookmarkEnd w:id="27"/>
+    <w:bookmarkStart w:id="34" w:name="results"/>
     <w:p>
       <w:pPr>
         <w:pStyle w:val="Heading1"/>
@@ -4713,7 +4732,7 @@
         <w:t xml:space="preserve">Results</w:t>
       </w:r>
     </w:p>
-    <w:bookmarkStart w:id="27" w:name="detection-quality"/>
+    <w:bookmarkStart w:id="28" w:name="detection-quality"/>
     <w:p>
       <w:pPr>
         <w:pStyle w:val="Heading2"/>
@@ -4940,8 +4959,8 @@
         <w:t xml:space="preserve">scores—and earlier versions flagged them; each drove a precision fix.</w:t>
       </w:r>
     </w:p>
-    <w:bookmarkEnd w:id="27"/>
-    <w:bookmarkStart w:id="28" w:name="metamorphic-stability"/>
+    <w:bookmarkEnd w:id="28"/>
+    <w:bookmarkStart w:id="29" w:name="metamorphic-stability"/>
     <w:p>
       <w:pPr>
         <w:pStyle w:val="Heading2"/>
@@ -4976,8 +4995,8 @@
         <w:t xml:space="preserve">in CI, so structural over-fitting cannot regress silently.</w:t>
       </w:r>
     </w:p>
-    <w:bookmarkEnd w:id="28"/>
-    <w:bookmarkStart w:id="31" w:name="field-prevalence"/>
+    <w:bookmarkEnd w:id="29"/>
+    <w:bookmarkStart w:id="32" w:name="field-prevalence"/>
     <w:p>
       <w:pPr>
         <w:pStyle w:val="Heading2"/>
@@ -5098,7 +5117,7 @@
         <w:t xml:space="preserve">state of shipped definitions, not the exception.</w:t>
       </w:r>
     </w:p>
-    <w:bookmarkStart w:id="30" w:name="cross-distribution-replication."/>
+    <w:bookmarkStart w:id="31" w:name="cross-distribution-replication."/>
     <w:p>
       <w:pPr>
         <w:pStyle w:val="Heading4"/>
@@ -5265,7 +5284,7 @@
         <w:t xml:space="preserve">is 10/10.</w:t>
       </w:r>
     </w:p>
-    <w:bookmarkStart w:id="29" w:name="tab:field-cross"/>
+    <w:bookmarkStart w:id="30" w:name="tab:field-cross"/>
     <w:p>
       <w:pPr>
         <w:pStyle w:val="TableCaption"/>
@@ -5518,10 +5537,10 @@
         </w:tc>
       </w:tr>
     </w:tbl>
-    <w:bookmarkEnd w:id="29"/>
     <w:bookmarkEnd w:id="30"/>
     <w:bookmarkEnd w:id="31"/>
-    <w:bookmarkStart w:id="32" w:name="posture-score-calibration"/>
+    <w:bookmarkEnd w:id="32"/>
+    <w:bookmarkStart w:id="33" w:name="posture-score-calibration"/>
     <w:p>
       <w:pPr>
         <w:pStyle w:val="Heading2"/>
@@ -5580,9 +5599,9 @@
         <w:t xml:space="preserve">the grade from a verdict into a worklist.</w:t>
       </w:r>
     </w:p>
-    <w:bookmarkEnd w:id="32"/>
     <w:bookmarkEnd w:id="33"/>
-    <w:bookmarkStart w:id="38" w:name="discussion"/>
+    <w:bookmarkEnd w:id="34"/>
+    <w:bookmarkStart w:id="39" w:name="discussion"/>
     <w:p>
       <w:pPr>
         <w:pStyle w:val="Heading1"/>
@@ -5591,7 +5610,7 @@
         <w:t xml:space="preserve">Discussion</w:t>
       </w:r>
     </w:p>
-    <w:bookmarkStart w:id="34" w:name="X2165ba1aee5e1139020764362739021df1c48a9"/>
+    <w:bookmarkStart w:id="35" w:name="X2165ba1aee5e1139020764362739021df1c48a9"/>
     <w:p>
       <w:pPr>
         <w:pStyle w:val="Heading4"/>
@@ -5671,8 +5690,8 @@
         <w:t xml:space="preserve">with the gate documenting exactly where its boundary lies.</w:t>
       </w:r>
     </w:p>
-    <w:bookmarkEnd w:id="34"/>
-    <w:bookmarkStart w:id="35" w:name="exposure-is-not-exploitation."/>
+    <w:bookmarkEnd w:id="35"/>
+    <w:bookmarkStart w:id="36" w:name="exposure-is-not-exploitation."/>
     <w:p>
       <w:pPr>
         <w:pStyle w:val="Heading4"/>
@@ -5719,8 +5738,8 @@
         <w:t xml:space="preserve">silent when it lands.</w:t>
       </w:r>
     </w:p>
-    <w:bookmarkEnd w:id="35"/>
-    <w:bookmarkStart w:id="36" w:name="severity-semantics-as-a-contract."/>
+    <w:bookmarkEnd w:id="36"/>
+    <w:bookmarkStart w:id="37" w:name="severity-semantics-as-a-contract."/>
     <w:p>
       <w:pPr>
         <w:pStyle w:val="Heading4"/>
@@ -5786,8 +5805,8 @@
         <w:t xml:space="preserve">audience; the gate treats it as a bug class, not a style choice.</w:t>
       </w:r>
     </w:p>
-    <w:bookmarkEnd w:id="36"/>
-    <w:bookmarkStart w:id="37" w:name="the-named-miss-as-methodology."/>
+    <w:bookmarkEnd w:id="37"/>
+    <w:bookmarkStart w:id="38" w:name="the-named-miss-as-methodology."/>
     <w:p>
       <w:pPr>
         <w:pStyle w:val="Heading4"/>
@@ -5844,9 +5863,9 @@
         <w:t xml:space="preserve">case inventory, name the misses) more transferable than any individual rule.</w:t>
       </w:r>
     </w:p>
-    <w:bookmarkEnd w:id="37"/>
     <w:bookmarkEnd w:id="38"/>
-    <w:bookmarkStart w:id="40" w:name="related-work"/>
+    <w:bookmarkEnd w:id="39"/>
+    <w:bookmarkStart w:id="41" w:name="related-work"/>
     <w:p>
       <w:pPr>
         <w:pStyle w:val="Heading1"/>
@@ -6052,7 +6071,7 @@
         <w:t xml:space="preserve">Taxonomies name the risks but do not detect them.</w:t>
       </w:r>
     </w:p>
-    <w:bookmarkStart w:id="39" w:name="tab:comparison"/>
+    <w:bookmarkStart w:id="40" w:name="tab:comparison"/>
     <w:p>
       <w:pPr>
         <w:pStyle w:val="TableCaption"/>
@@ -6739,9 +6758,9 @@
         </w:tc>
       </w:tr>
     </w:tbl>
-    <w:bookmarkEnd w:id="39"/>
     <w:bookmarkEnd w:id="40"/>
-    <w:bookmarkStart w:id="41" w:name="sec:limitations"/>
+    <w:bookmarkEnd w:id="41"/>
+    <w:bookmarkStart w:id="42" w:name="sec:limitations"/>
     <w:p>
       <w:pPr>
         <w:pStyle w:val="Heading1"/>
@@ -6970,8 +6989,8 @@
         <w:t xml:space="preserve">complementary, not overlapping, coverage.</w:t>
       </w:r>
     </w:p>
-    <w:bookmarkEnd w:id="41"/>
-    <w:bookmarkStart w:id="61" w:name="conclusion"/>
+    <w:bookmarkEnd w:id="42"/>
+    <w:bookmarkStart w:id="62" w:name="conclusion"/>
     <w:p>
       <w:pPr>
         <w:pStyle w:val="Heading1"/>
@@ -7079,8 +7098,8 @@
         <w:t xml:space="preserve">format, making least-privilege lintable ecosystem-wide.</w:t>
       </w:r>
     </w:p>
-    <w:bookmarkStart w:id="60" w:name="refs"/>
-    <w:bookmarkStart w:id="43" w:name="ref-anthropic2024agents"/>
+    <w:bookmarkStart w:id="61" w:name="refs"/>
+    <w:bookmarkStart w:id="44" w:name="ref-anthropic2024agents"/>
     <w:p>
       <w:pPr>
         <w:pStyle w:val="Bibliography"/>
@@ -7104,7 +7123,7 @@
       <w:r>
         <w:t xml:space="preserve"> </w:t>
       </w:r>
-      <w:hyperlink r:id="rId42">
+      <w:hyperlink r:id="rId43">
         <w:r>
           <w:rPr>
             <w:rStyle w:val="Hyperlink"/>
@@ -7116,8 +7135,8 @@
         <w:t xml:space="preserve">.</w:t>
       </w:r>
     </w:p>
-    <w:bookmarkEnd w:id="43"/>
-    <w:bookmarkStart w:id="45" w:name="ref-anthropic2025petri"/>
+    <w:bookmarkEnd w:id="44"/>
+    <w:bookmarkStart w:id="46" w:name="ref-anthropic2025petri"/>
     <w:p>
       <w:pPr>
         <w:pStyle w:val="Bibliography"/>
@@ -7141,7 +7160,7 @@
       <w:r>
         <w:t xml:space="preserve"> </w:t>
       </w:r>
-      <w:hyperlink r:id="rId44">
+      <w:hyperlink r:id="rId45">
         <w:r>
           <w:rPr>
             <w:rStyle w:val="Hyperlink"/>
@@ -7153,8 +7172,8 @@
         <w:t xml:space="preserve">.</w:t>
       </w:r>
     </w:p>
-    <w:bookmarkEnd w:id="45"/>
-    <w:bookmarkStart w:id="47" w:name="ref-greshake2023indirect"/>
+    <w:bookmarkEnd w:id="46"/>
+    <w:bookmarkStart w:id="48" w:name="ref-greshake2023indirect"/>
     <w:p>
       <w:pPr>
         <w:pStyle w:val="Bibliography"/>
@@ -7178,7 +7197,7 @@
       <w:r>
         <w:t xml:space="preserve"> </w:t>
       </w:r>
-      <w:hyperlink r:id="rId46">
+      <w:hyperlink r:id="rId47">
         <w:r>
           <w:rPr>
             <w:rStyle w:val="Hyperlink"/>
@@ -7190,8 +7209,8 @@
         <w:t xml:space="preserve">.</w:t>
       </w:r>
     </w:p>
-    <w:bookmarkEnd w:id="47"/>
-    <w:bookmarkStart w:id="49" w:name="ref-mitre2024atlas"/>
+    <w:bookmarkEnd w:id="48"/>
+    <w:bookmarkStart w:id="50" w:name="ref-mitre2024atlas"/>
     <w:p>
       <w:pPr>
         <w:pStyle w:val="Bibliography"/>
@@ -7215,7 +7234,7 @@
       <w:r>
         <w:t xml:space="preserve"> </w:t>
       </w:r>
-      <w:hyperlink r:id="rId48">
+      <w:hyperlink r:id="rId49">
         <w:r>
           <w:rPr>
             <w:rStyle w:val="Hyperlink"/>
@@ -7227,8 +7246,8 @@
         <w:t xml:space="preserve">.</w:t>
       </w:r>
     </w:p>
-    <w:bookmarkEnd w:id="49"/>
-    <w:bookmarkStart w:id="51" w:name="ref-owasp2025llm"/>
+    <w:bookmarkEnd w:id="50"/>
+    <w:bookmarkStart w:id="52" w:name="ref-owasp2025llm"/>
     <w:p>
       <w:pPr>
         <w:pStyle w:val="Bibliography"/>
@@ -7252,7 +7271,7 @@
       <w:r>
         <w:t xml:space="preserve"> </w:t>
       </w:r>
-      <w:hyperlink r:id="rId50">
+      <w:hyperlink r:id="rId51">
         <w:r>
           <w:rPr>
             <w:rStyle w:val="Hyperlink"/>
@@ -7264,8 +7283,8 @@
         <w:t xml:space="preserve">.</w:t>
       </w:r>
     </w:p>
-    <w:bookmarkEnd w:id="51"/>
-    <w:bookmarkStart w:id="53" w:name="ref-perez2022ignore"/>
+    <w:bookmarkEnd w:id="52"/>
+    <w:bookmarkStart w:id="54" w:name="ref-perez2022ignore"/>
     <w:p>
       <w:pPr>
         <w:pStyle w:val="Bibliography"/>
@@ -7289,7 +7308,7 @@
       <w:r>
         <w:t xml:space="preserve"> </w:t>
       </w:r>
-      <w:hyperlink r:id="rId52">
+      <w:hyperlink r:id="rId53">
         <w:r>
           <w:rPr>
             <w:rStyle w:val="Hyperlink"/>
@@ -7301,8 +7320,8 @@
         <w:t xml:space="preserve">.</w:t>
       </w:r>
     </w:p>
-    <w:bookmarkEnd w:id="53"/>
-    <w:bookmarkStart w:id="55" w:name="ref-bandit2024"/>
+    <w:bookmarkEnd w:id="54"/>
+    <w:bookmarkStart w:id="56" w:name="ref-bandit2024"/>
     <w:p>
       <w:pPr>
         <w:pStyle w:val="Bibliography"/>
@@ -7326,7 +7345,7 @@
       <w:r>
         <w:t xml:space="preserve"> </w:t>
       </w:r>
-      <w:hyperlink r:id="rId54">
+      <w:hyperlink r:id="rId55">
         <w:r>
           <w:rPr>
             <w:rStyle w:val="Hyperlink"/>
@@ -7338,8 +7357,8 @@
         <w:t xml:space="preserve">.</w:t>
       </w:r>
     </w:p>
-    <w:bookmarkEnd w:id="55"/>
-    <w:bookmarkStart w:id="57" w:name="ref-semgrep2024"/>
+    <w:bookmarkEnd w:id="56"/>
+    <w:bookmarkStart w:id="58" w:name="ref-semgrep2024"/>
     <w:p>
       <w:pPr>
         <w:pStyle w:val="Bibliography"/>
@@ -7363,7 +7382,7 @@
       <w:r>
         <w:t xml:space="preserve"> </w:t>
       </w:r>
-      <w:hyperlink r:id="rId56">
+      <w:hyperlink r:id="rId57">
         <w:r>
           <w:rPr>
             <w:rStyle w:val="Hyperlink"/>
@@ -7375,8 +7394,8 @@
         <w:t xml:space="preserve">.</w:t>
       </w:r>
     </w:p>
-    <w:bookmarkEnd w:id="57"/>
-    <w:bookmarkStart w:id="59" w:name="ref-willison2022prompt"/>
+    <w:bookmarkEnd w:id="58"/>
+    <w:bookmarkStart w:id="60" w:name="ref-willison2022prompt"/>
     <w:p>
       <w:pPr>
         <w:pStyle w:val="Bibliography"/>
@@ -7400,7 +7419,7 @@
       <w:r>
         <w:t xml:space="preserve"> </w:t>
       </w:r>
-      <w:hyperlink r:id="rId58">
+      <w:hyperlink r:id="rId59">
         <w:r>
           <w:rPr>
             <w:rStyle w:val="Hyperlink"/>
@@ -7412,9 +7431,9 @@
         <w:t xml:space="preserve">.</w:t>
       </w:r>
     </w:p>
-    <w:bookmarkEnd w:id="59"/>
     <w:bookmarkEnd w:id="60"/>
     <w:bookmarkEnd w:id="61"/>
+    <w:bookmarkEnd w:id="62"/>
     <w:sectPr>
       <w:footnotePr>
         <w:numRestart w:val="eachSect"/>

</xml_diff>

<commit_message>
Harden AgentGuard preprint artifact
</commit_message>
<xml_diff>
--- a/paper/agentguard-paper.docx
+++ b/paper/agentguard-paper.docx
@@ -177,7 +177,25 @@
         </m:r>
       </m:oMath>
       <w:r>
-        <w:t xml:space="preserve">9 ms per definition). The core claim is narrow: privilege risk in agent definitions can be a deterministic,</w:t>
+        <w:t xml:space="preserve">9 ms per definition).</w:t>
+      </w:r>
+      <w:r>
+        <w:t xml:space="preserve"> </w:t>
+      </w:r>
+      <w:r>
+        <w:t xml:space="preserve">The full artifact is versioned with a public DOI and contains the code, paper source, benchmark,</w:t>
+      </w:r>
+      <w:r>
+        <w:t xml:space="preserve"> </w:t>
+      </w:r>
+      <w:r>
+        <w:t xml:space="preserve">metamorphic tests, baseline scripts, and release-gate checks needed to reproduce the headline</w:t>
+      </w:r>
+      <w:r>
+        <w:t xml:space="preserve"> </w:t>
+      </w:r>
+      <w:r>
+        <w:t xml:space="preserve">claims. The core claim is narrow: privilege risk in agent definitions can be a deterministic,</w:t>
       </w:r>
       <w:r>
         <w:t xml:space="preserve"> </w:t>
@@ -556,6 +574,29 @@
       </w:r>
       <w:r>
         <w:t xml:space="preserve">injection-to-action attacks.</w:t>
+      </w:r>
+    </w:p>
+    <w:p>
+      <w:pPr>
+        <w:numPr>
+          <w:ilvl w:val="0"/>
+          <w:numId w:val="1001"/>
+        </w:numPr>
+      </w:pPr>
+      <w:r>
+        <w:t xml:space="preserve">A public reproducibility package with a citable DOI, release artifacts, source paper,</w:t>
+      </w:r>
+      <w:r>
+        <w:t xml:space="preserve"> </w:t>
+      </w:r>
+      <w:r>
+        <w:t xml:space="preserve">benchmark scripts, CI gates, and explicit artifact commands, so the paper can be inspected as a</w:t>
+      </w:r>
+      <w:r>
+        <w:t xml:space="preserve"> </w:t>
+      </w:r>
+      <w:r>
+        <w:t xml:space="preserve">runnable system rather than a standalone claim.</w:t>
       </w:r>
     </w:p>
     <w:bookmarkEnd w:id="10"/>
@@ -3400,7 +3441,7 @@
     </w:p>
     <w:bookmarkEnd w:id="20"/>
     <w:bookmarkEnd w:id="21"/>
-    <w:bookmarkStart w:id="27" w:name="experiments"/>
+    <w:bookmarkStart w:id="28" w:name="experiments"/>
     <w:p>
       <w:pPr>
         <w:pStyle w:val="Heading1"/>
@@ -3534,6 +3575,137 @@
       </w:r>
       <w:r>
         <w:t xml:space="preserve">continuously re-verified rather than frozen at submission time.</w:t>
+      </w:r>
+    </w:p>
+    <w:bookmarkStart w:id="27" w:name="sec:repro"/>
+    <w:p>
+      <w:pPr>
+        <w:pStyle w:val="Heading2"/>
+      </w:pPr>
+      <w:r>
+        <w:t xml:space="preserve">Reproducibility Package</w:t>
+      </w:r>
+    </w:p>
+    <w:p>
+      <w:pPr>
+        <w:pStyle w:val="FirstParagraph"/>
+      </w:pPr>
+      <w:r>
+        <w:t xml:space="preserve">The artifact is public and versioned: the repository release contains the rendered paper and arXiv</w:t>
+      </w:r>
+      <w:r>
+        <w:t xml:space="preserve"> </w:t>
+      </w:r>
+      <w:r>
+        <w:t xml:space="preserve">source archive, and the Zenodo concept DOI is</w:t>
+      </w:r>
+      <w:r>
+        <w:t xml:space="preserve"> </w:t>
+      </w:r>
+      <w:hyperlink r:id="rId9">
+        <w:r>
+          <w:rPr>
+            <w:rStyle w:val="Hyperlink"/>
+          </w:rPr>
+          <w:t xml:space="preserve">10.5281/zenodo.21420490</w:t>
+        </w:r>
+      </w:hyperlink>
+      <w:r>
+        <w:t xml:space="preserve">. The paper’s claims are</w:t>
+      </w:r>
+      <w:r>
+        <w:t xml:space="preserve"> </w:t>
+      </w:r>
+      <w:r>
+        <w:t xml:space="preserve">designed to be checked without credentials, paid model calls, or private data. The minimum</w:t>
+      </w:r>
+      <w:r>
+        <w:t xml:space="preserve"> </w:t>
+      </w:r>
+      <w:r>
+        <w:t xml:space="preserve">reproduction path is:</w:t>
+      </w:r>
+    </w:p>
+    <w:p>
+      <w:pPr>
+        <w:pStyle w:val="SourceCode"/>
+      </w:pPr>
+      <w:r>
+        <w:rPr>
+          <w:rStyle w:val="VerbatimChar"/>
+        </w:rPr>
+        <w:t xml:space="preserve">python eval/benchmark.py --verbose</w:t>
+      </w:r>
+      <w:r>
+        <w:br/>
+      </w:r>
+      <w:r>
+        <w:rPr>
+          <w:rStyle w:val="VerbatimChar"/>
+        </w:rPr>
+        <w:t xml:space="preserve">python eval/adversarial_review.py</w:t>
+      </w:r>
+      <w:r>
+        <w:br/>
+      </w:r>
+      <w:r>
+        <w:rPr>
+          <w:rStyle w:val="VerbatimChar"/>
+        </w:rPr>
+        <w:t xml:space="preserve">python eval/naive_baselines.py</w:t>
+      </w:r>
+      <w:r>
+        <w:br/>
+      </w:r>
+      <w:r>
+        <w:rPr>
+          <w:rStyle w:val="VerbatimChar"/>
+        </w:rPr>
+        <w:t xml:space="preserve">python -m pytest -q</w:t>
+      </w:r>
+    </w:p>
+    <w:p>
+      <w:pPr>
+        <w:pStyle w:val="FirstParagraph"/>
+      </w:pPr>
+      <w:r>
+        <w:t xml:space="preserve">The full release gate additionally runs type checking, contract verification, workflow audit,</w:t>
+      </w:r>
+      <w:r>
+        <w:t xml:space="preserve"> </w:t>
+      </w:r>
+      <w:r>
+        <w:t xml:space="preserve">package-build validation, and AgentGuard’s own publish check. This matters for the central claim:</w:t>
+      </w:r>
+      <w:r>
+        <w:t xml:space="preserve"> </w:t>
+      </w:r>
+      <w:r>
+        <w:t xml:space="preserve">the linter is not evaluated by a one-off notebook but by the same deterministic gate a user would</w:t>
+      </w:r>
+      <w:r>
+        <w:t xml:space="preserve"> </w:t>
+      </w:r>
+      <w:r>
+        <w:t xml:space="preserve">run in CI. The artifact intentionally separates three classes of evidence: frozen benchmark cases</w:t>
+      </w:r>
+      <w:r>
+        <w:t xml:space="preserve"> </w:t>
+      </w:r>
+      <w:r>
+        <w:t xml:space="preserve">for recall/precision, mechanically generated metamorphic variants for stability, and field-study</w:t>
+      </w:r>
+      <w:r>
+        <w:t xml:space="preserve"> </w:t>
+      </w:r>
+      <w:r>
+        <w:t xml:space="preserve">snapshots for ecosystem prevalence. No claim in this paper depends on a private corpus or</w:t>
+      </w:r>
+      <w:r>
+        <w:t xml:space="preserve"> </w:t>
+      </w:r>
+      <w:r>
+        <w:t xml:space="preserve">non-reproducible model judgment.</w:t>
       </w:r>
     </w:p>
     <w:bookmarkStart w:id="25" w:name="cost."/>
@@ -4723,7 +4895,8 @@
     </w:p>
     <w:bookmarkEnd w:id="26"/>
     <w:bookmarkEnd w:id="27"/>
-    <w:bookmarkStart w:id="34" w:name="results"/>
+    <w:bookmarkEnd w:id="28"/>
+    <w:bookmarkStart w:id="35" w:name="results"/>
     <w:p>
       <w:pPr>
         <w:pStyle w:val="Heading1"/>
@@ -4732,7 +4905,7 @@
         <w:t xml:space="preserve">Results</w:t>
       </w:r>
     </w:p>
-    <w:bookmarkStart w:id="28" w:name="detection-quality"/>
+    <w:bookmarkStart w:id="29" w:name="detection-quality"/>
     <w:p>
       <w:pPr>
         <w:pStyle w:val="Heading2"/>
@@ -4959,8 +5132,8 @@
         <w:t xml:space="preserve">scores—and earlier versions flagged them; each drove a precision fix.</w:t>
       </w:r>
     </w:p>
-    <w:bookmarkEnd w:id="28"/>
-    <w:bookmarkStart w:id="29" w:name="metamorphic-stability"/>
+    <w:bookmarkEnd w:id="29"/>
+    <w:bookmarkStart w:id="30" w:name="metamorphic-stability"/>
     <w:p>
       <w:pPr>
         <w:pStyle w:val="Heading2"/>
@@ -4995,8 +5168,8 @@
         <w:t xml:space="preserve">in CI, so structural over-fitting cannot regress silently.</w:t>
       </w:r>
     </w:p>
-    <w:bookmarkEnd w:id="29"/>
-    <w:bookmarkStart w:id="32" w:name="field-prevalence"/>
+    <w:bookmarkEnd w:id="30"/>
+    <w:bookmarkStart w:id="33" w:name="field-prevalence"/>
     <w:p>
       <w:pPr>
         <w:pStyle w:val="Heading2"/>
@@ -5117,7 +5290,7 @@
         <w:t xml:space="preserve">state of shipped definitions, not the exception.</w:t>
       </w:r>
     </w:p>
-    <w:bookmarkStart w:id="31" w:name="cross-distribution-replication."/>
+    <w:bookmarkStart w:id="32" w:name="cross-distribution-replication."/>
     <w:p>
       <w:pPr>
         <w:pStyle w:val="Heading4"/>
@@ -5284,7 +5457,7 @@
         <w:t xml:space="preserve">is 10/10.</w:t>
       </w:r>
     </w:p>
-    <w:bookmarkStart w:id="30" w:name="tab:field-cross"/>
+    <w:bookmarkStart w:id="31" w:name="tab:field-cross"/>
     <w:p>
       <w:pPr>
         <w:pStyle w:val="TableCaption"/>
@@ -5537,10 +5710,10 @@
         </w:tc>
       </w:tr>
     </w:tbl>
-    <w:bookmarkEnd w:id="30"/>
     <w:bookmarkEnd w:id="31"/>
     <w:bookmarkEnd w:id="32"/>
-    <w:bookmarkStart w:id="33" w:name="posture-score-calibration"/>
+    <w:bookmarkEnd w:id="33"/>
+    <w:bookmarkStart w:id="34" w:name="posture-score-calibration"/>
     <w:p>
       <w:pPr>
         <w:pStyle w:val="Heading2"/>
@@ -5599,9 +5772,9 @@
         <w:t xml:space="preserve">the grade from a verdict into a worklist.</w:t>
       </w:r>
     </w:p>
-    <w:bookmarkEnd w:id="33"/>
     <w:bookmarkEnd w:id="34"/>
-    <w:bookmarkStart w:id="39" w:name="discussion"/>
+    <w:bookmarkEnd w:id="35"/>
+    <w:bookmarkStart w:id="41" w:name="discussion"/>
     <w:p>
       <w:pPr>
         <w:pStyle w:val="Heading1"/>
@@ -5610,7 +5783,7 @@
         <w:t xml:space="preserve">Discussion</w:t>
       </w:r>
     </w:p>
-    <w:bookmarkStart w:id="35" w:name="X2165ba1aee5e1139020764362739021df1c48a9"/>
+    <w:bookmarkStart w:id="36" w:name="X2165ba1aee5e1139020764362739021df1c48a9"/>
     <w:p>
       <w:pPr>
         <w:pStyle w:val="Heading4"/>
@@ -5690,8 +5863,8 @@
         <w:t xml:space="preserve">with the gate documenting exactly where its boundary lies.</w:t>
       </w:r>
     </w:p>
-    <w:bookmarkEnd w:id="35"/>
-    <w:bookmarkStart w:id="36" w:name="exposure-is-not-exploitation."/>
+    <w:bookmarkEnd w:id="36"/>
+    <w:bookmarkStart w:id="37" w:name="exposure-is-not-exploitation."/>
     <w:p>
       <w:pPr>
         <w:pStyle w:val="Heading4"/>
@@ -5738,8 +5911,8 @@
         <w:t xml:space="preserve">silent when it lands.</w:t>
       </w:r>
     </w:p>
-    <w:bookmarkEnd w:id="36"/>
-    <w:bookmarkStart w:id="37" w:name="severity-semantics-as-a-contract."/>
+    <w:bookmarkEnd w:id="37"/>
+    <w:bookmarkStart w:id="38" w:name="severity-semantics-as-a-contract."/>
     <w:p>
       <w:pPr>
         <w:pStyle w:val="Heading4"/>
@@ -5805,8 +5978,8 @@
         <w:t xml:space="preserve">audience; the gate treats it as a bug class, not a style choice.</w:t>
       </w:r>
     </w:p>
-    <w:bookmarkEnd w:id="37"/>
-    <w:bookmarkStart w:id="38" w:name="the-named-miss-as-methodology."/>
+    <w:bookmarkEnd w:id="38"/>
+    <w:bookmarkStart w:id="39" w:name="the-named-miss-as-methodology."/>
     <w:p>
       <w:pPr>
         <w:pStyle w:val="Heading4"/>
@@ -5863,9 +6036,69 @@
         <w:t xml:space="preserve">case inventory, name the misses) more transferable than any individual rule.</w:t>
       </w:r>
     </w:p>
-    <w:bookmarkEnd w:id="38"/>
     <w:bookmarkEnd w:id="39"/>
-    <w:bookmarkStart w:id="41" w:name="related-work"/>
+    <w:bookmarkStart w:id="40" w:name="what-would-change-the-conclusion"/>
+    <w:p>
+      <w:pPr>
+        <w:pStyle w:val="Heading4"/>
+      </w:pPr>
+      <w:r>
+        <w:t xml:space="preserve">What would change the conclusion?</w:t>
+      </w:r>
+    </w:p>
+    <w:p>
+      <w:pPr>
+        <w:pStyle w:val="FirstParagraph"/>
+      </w:pPr>
+      <w:r>
+        <w:t xml:space="preserve">The strongest possible negative result would be an independently labeled corpus where the AL300</w:t>
+      </w:r>
+      <w:r>
+        <w:t xml:space="preserve"> </w:t>
+      </w:r>
+      <w:r>
+        <w:t xml:space="preserve">chain condition produces many false alarms once human reviewers inspect the definitions. That would</w:t>
+      </w:r>
+      <w:r>
+        <w:t xml:space="preserve"> </w:t>
+      </w:r>
+      <w:r>
+        <w:t xml:space="preserve">not merely lower a metric; it would falsify the paper’s central engineering claim that the</w:t>
+      </w:r>
+      <w:r>
+        <w:t xml:space="preserve"> </w:t>
+      </w:r>
+      <w:r>
+        <w:t xml:space="preserve">structural precondition is precise enough to gate by default. The current evidence argues against</w:t>
+      </w:r>
+      <w:r>
+        <w:t xml:space="preserve"> </w:t>
+      </w:r>
+      <w:r>
+        <w:t xml:space="preserve">that outcome in three ways: zero false alarms on the gated negative set, precision-hardening from</w:t>
+      </w:r>
+      <w:r>
+        <w:t xml:space="preserve"> </w:t>
+      </w:r>
+      <w:r>
+        <w:t xml:space="preserve">real marketplace false positives, and a manual precision check over the independent third-party</w:t>
+      </w:r>
+      <w:r>
+        <w:t xml:space="preserve"> </w:t>
+      </w:r>
+      <w:r>
+        <w:t xml:space="preserve">chain findings. Still, the next step is external human labeling, not another self-authored</w:t>
+      </w:r>
+      <w:r>
+        <w:t xml:space="preserve"> </w:t>
+      </w:r>
+      <w:r>
+        <w:t xml:space="preserve">benchmark expansion.</w:t>
+      </w:r>
+    </w:p>
+    <w:bookmarkEnd w:id="40"/>
+    <w:bookmarkEnd w:id="41"/>
+    <w:bookmarkStart w:id="43" w:name="related-work"/>
     <w:p>
       <w:pPr>
         <w:pStyle w:val="Heading1"/>
@@ -6071,7 +6304,7 @@
         <w:t xml:space="preserve">Taxonomies name the risks but do not detect them.</w:t>
       </w:r>
     </w:p>
-    <w:bookmarkStart w:id="40" w:name="tab:comparison"/>
+    <w:bookmarkStart w:id="42" w:name="tab:comparison"/>
     <w:p>
       <w:pPr>
         <w:pStyle w:val="TableCaption"/>
@@ -6758,9 +6991,9 @@
         </w:tc>
       </w:tr>
     </w:tbl>
-    <w:bookmarkEnd w:id="40"/>
-    <w:bookmarkEnd w:id="41"/>
-    <w:bookmarkStart w:id="42" w:name="sec:limitations"/>
+    <w:bookmarkEnd w:id="42"/>
+    <w:bookmarkEnd w:id="43"/>
+    <w:bookmarkStart w:id="44" w:name="sec:limitations"/>
     <w:p>
       <w:pPr>
         <w:pStyle w:val="Heading1"/>
@@ -6989,8 +7222,68 @@
         <w:t xml:space="preserve">complementary, not overlapping, coverage.</w:t>
       </w:r>
     </w:p>
-    <w:bookmarkEnd w:id="42"/>
-    <w:bookmarkStart w:id="62" w:name="conclusion"/>
+    <w:bookmarkEnd w:id="44"/>
+    <w:bookmarkStart w:id="45" w:name="ethics-and-ai-use-disclosure"/>
+    <w:p>
+      <w:pPr>
+        <w:pStyle w:val="Heading1"/>
+      </w:pPr>
+      <w:r>
+        <w:t xml:space="preserve">Ethics and AI-Use Disclosure</w:t>
+      </w:r>
+    </w:p>
+    <w:p>
+      <w:pPr>
+        <w:pStyle w:val="FirstParagraph"/>
+      </w:pPr>
+      <w:r>
+        <w:t xml:space="preserve">AgentGuard scans public or user-provided agent definitions for structural security risk. The field</w:t>
+      </w:r>
+      <w:r>
+        <w:t xml:space="preserve"> </w:t>
+      </w:r>
+      <w:r>
+        <w:t xml:space="preserve">study reports aggregate exposure rates and does not publish a per-author vulnerability list or</w:t>
+      </w:r>
+      <w:r>
+        <w:t xml:space="preserve"> </w:t>
+      </w:r>
+      <w:r>
+        <w:t xml:space="preserve">claim that specific packages were exploited. The worked exploit example is synthetic and</w:t>
+      </w:r>
+      <w:r>
+        <w:t xml:space="preserve"> </w:t>
+      </w:r>
+      <w:r>
+        <w:t xml:space="preserve">minimal; it is included to make the capability chain concrete without targeting a live system.</w:t>
+      </w:r>
+      <w:r>
+        <w:t xml:space="preserve"> </w:t>
+      </w:r>
+      <w:r>
+        <w:t xml:space="preserve">The artifact contains deterministic scripts and generated reports; no private logs, credentials,</w:t>
+      </w:r>
+      <w:r>
+        <w:t xml:space="preserve"> </w:t>
+      </w:r>
+      <w:r>
+        <w:t xml:space="preserve">or personal data are required to reproduce the results. AI assistance was used for drafting,</w:t>
+      </w:r>
+      <w:r>
+        <w:t xml:space="preserve"> </w:t>
+      </w:r>
+      <w:r>
+        <w:t xml:space="preserve">editing, and local iteration of the manuscript and artifact text; all reported measurements come</w:t>
+      </w:r>
+      <w:r>
+        <w:t xml:space="preserve"> </w:t>
+      </w:r>
+      <w:r>
+        <w:t xml:space="preserve">from committed scripts or explicitly described manual checks.</w:t>
+      </w:r>
+    </w:p>
+    <w:bookmarkEnd w:id="45"/>
+    <w:bookmarkStart w:id="65" w:name="conclusion"/>
     <w:p>
       <w:pPr>
         <w:pStyle w:val="Heading1"/>
@@ -7098,8 +7391,8 @@
         <w:t xml:space="preserve">format, making least-privilege lintable ecosystem-wide.</w:t>
       </w:r>
     </w:p>
-    <w:bookmarkStart w:id="61" w:name="refs"/>
-    <w:bookmarkStart w:id="44" w:name="ref-anthropic2024agents"/>
+    <w:bookmarkStart w:id="64" w:name="refs"/>
+    <w:bookmarkStart w:id="47" w:name="ref-anthropic2024agents"/>
     <w:p>
       <w:pPr>
         <w:pStyle w:val="Bibliography"/>
@@ -7123,7 +7416,7 @@
       <w:r>
         <w:t xml:space="preserve"> </w:t>
       </w:r>
-      <w:hyperlink r:id="rId43">
+      <w:hyperlink r:id="rId46">
         <w:r>
           <w:rPr>
             <w:rStyle w:val="Hyperlink"/>
@@ -7135,8 +7428,8 @@
         <w:t xml:space="preserve">.</w:t>
       </w:r>
     </w:p>
-    <w:bookmarkEnd w:id="44"/>
-    <w:bookmarkStart w:id="46" w:name="ref-anthropic2025petri"/>
+    <w:bookmarkEnd w:id="47"/>
+    <w:bookmarkStart w:id="49" w:name="ref-anthropic2025petri"/>
     <w:p>
       <w:pPr>
         <w:pStyle w:val="Bibliography"/>
@@ -7160,7 +7453,7 @@
       <w:r>
         <w:t xml:space="preserve"> </w:t>
       </w:r>
-      <w:hyperlink r:id="rId45">
+      <w:hyperlink r:id="rId48">
         <w:r>
           <w:rPr>
             <w:rStyle w:val="Hyperlink"/>
@@ -7172,8 +7465,8 @@
         <w:t xml:space="preserve">.</w:t>
       </w:r>
     </w:p>
-    <w:bookmarkEnd w:id="46"/>
-    <w:bookmarkStart w:id="48" w:name="ref-greshake2023indirect"/>
+    <w:bookmarkEnd w:id="49"/>
+    <w:bookmarkStart w:id="51" w:name="ref-greshake2023indirect"/>
     <w:p>
       <w:pPr>
         <w:pStyle w:val="Bibliography"/>
@@ -7197,7 +7490,7 @@
       <w:r>
         <w:t xml:space="preserve"> </w:t>
       </w:r>
-      <w:hyperlink r:id="rId47">
+      <w:hyperlink r:id="rId50">
         <w:r>
           <w:rPr>
             <w:rStyle w:val="Hyperlink"/>
@@ -7209,8 +7502,8 @@
         <w:t xml:space="preserve">.</w:t>
       </w:r>
     </w:p>
-    <w:bookmarkEnd w:id="48"/>
-    <w:bookmarkStart w:id="50" w:name="ref-mitre2024atlas"/>
+    <w:bookmarkEnd w:id="51"/>
+    <w:bookmarkStart w:id="53" w:name="ref-mitre2024atlas"/>
     <w:p>
       <w:pPr>
         <w:pStyle w:val="Bibliography"/>
@@ -7234,7 +7527,7 @@
       <w:r>
         <w:t xml:space="preserve"> </w:t>
       </w:r>
-      <w:hyperlink r:id="rId49">
+      <w:hyperlink r:id="rId52">
         <w:r>
           <w:rPr>
             <w:rStyle w:val="Hyperlink"/>
@@ -7246,8 +7539,8 @@
         <w:t xml:space="preserve">.</w:t>
       </w:r>
     </w:p>
-    <w:bookmarkEnd w:id="50"/>
-    <w:bookmarkStart w:id="52" w:name="ref-owasp2025llm"/>
+    <w:bookmarkEnd w:id="53"/>
+    <w:bookmarkStart w:id="55" w:name="ref-owasp2025llm"/>
     <w:p>
       <w:pPr>
         <w:pStyle w:val="Bibliography"/>
@@ -7271,7 +7564,7 @@
       <w:r>
         <w:t xml:space="preserve"> </w:t>
       </w:r>
-      <w:hyperlink r:id="rId51">
+      <w:hyperlink r:id="rId54">
         <w:r>
           <w:rPr>
             <w:rStyle w:val="Hyperlink"/>
@@ -7283,8 +7576,8 @@
         <w:t xml:space="preserve">.</w:t>
       </w:r>
     </w:p>
-    <w:bookmarkEnd w:id="52"/>
-    <w:bookmarkStart w:id="54" w:name="ref-perez2022ignore"/>
+    <w:bookmarkEnd w:id="55"/>
+    <w:bookmarkStart w:id="57" w:name="ref-perez2022ignore"/>
     <w:p>
       <w:pPr>
         <w:pStyle w:val="Bibliography"/>
@@ -7308,7 +7601,7 @@
       <w:r>
         <w:t xml:space="preserve"> </w:t>
       </w:r>
-      <w:hyperlink r:id="rId53">
+      <w:hyperlink r:id="rId56">
         <w:r>
           <w:rPr>
             <w:rStyle w:val="Hyperlink"/>
@@ -7320,8 +7613,8 @@
         <w:t xml:space="preserve">.</w:t>
       </w:r>
     </w:p>
-    <w:bookmarkEnd w:id="54"/>
-    <w:bookmarkStart w:id="56" w:name="ref-bandit2024"/>
+    <w:bookmarkEnd w:id="57"/>
+    <w:bookmarkStart w:id="59" w:name="ref-bandit2024"/>
     <w:p>
       <w:pPr>
         <w:pStyle w:val="Bibliography"/>
@@ -7345,7 +7638,7 @@
       <w:r>
         <w:t xml:space="preserve"> </w:t>
       </w:r>
-      <w:hyperlink r:id="rId55">
+      <w:hyperlink r:id="rId58">
         <w:r>
           <w:rPr>
             <w:rStyle w:val="Hyperlink"/>
@@ -7357,8 +7650,8 @@
         <w:t xml:space="preserve">.</w:t>
       </w:r>
     </w:p>
-    <w:bookmarkEnd w:id="56"/>
-    <w:bookmarkStart w:id="58" w:name="ref-semgrep2024"/>
+    <w:bookmarkEnd w:id="59"/>
+    <w:bookmarkStart w:id="61" w:name="ref-semgrep2024"/>
     <w:p>
       <w:pPr>
         <w:pStyle w:val="Bibliography"/>
@@ -7382,7 +7675,7 @@
       <w:r>
         <w:t xml:space="preserve"> </w:t>
       </w:r>
-      <w:hyperlink r:id="rId57">
+      <w:hyperlink r:id="rId60">
         <w:r>
           <w:rPr>
             <w:rStyle w:val="Hyperlink"/>
@@ -7394,8 +7687,8 @@
         <w:t xml:space="preserve">.</w:t>
       </w:r>
     </w:p>
-    <w:bookmarkEnd w:id="58"/>
-    <w:bookmarkStart w:id="60" w:name="ref-willison2022prompt"/>
+    <w:bookmarkEnd w:id="61"/>
+    <w:bookmarkStart w:id="63" w:name="ref-willison2022prompt"/>
     <w:p>
       <w:pPr>
         <w:pStyle w:val="Bibliography"/>
@@ -7419,7 +7712,7 @@
       <w:r>
         <w:t xml:space="preserve"> </w:t>
       </w:r>
-      <w:hyperlink r:id="rId59">
+      <w:hyperlink r:id="rId62">
         <w:r>
           <w:rPr>
             <w:rStyle w:val="Hyperlink"/>
@@ -7431,9 +7724,9 @@
         <w:t xml:space="preserve">.</w:t>
       </w:r>
     </w:p>
-    <w:bookmarkEnd w:id="60"/>
-    <w:bookmarkEnd w:id="61"/>
-    <w:bookmarkEnd w:id="62"/>
+    <w:bookmarkEnd w:id="63"/>
+    <w:bookmarkEnd w:id="64"/>
+    <w:bookmarkEnd w:id="65"/>
     <w:sectPr>
       <w:footnotePr>
         <w:numRestart w:val="eachSect"/>

</xml_diff>